<commit_message>
Add session management and auto-login with shared_preferences
Introduced SessionManager using shared_preferences to persist user sessions. Updated app startup to auto-login if a session exists, and added logout functionality. Modified sign-in and sign-up flows to save user sessions and improved navigation logic. Updated dependencies and plugin registration for shared_preferences support.
</commit_message>
<xml_diff>
--- a/Szymczak_Michał_56135.docx
+++ b/Szymczak_Michał_56135.docx
@@ -77,10 +77,10 @@
         </w:rPr>
         <w:lastRenderedPageBreak/>
         <w:drawing>
-          <wp:inline distT="0" distB="0" distL="0" distR="0" wp14:anchorId="4BF919A2" wp14:editId="2DC9EBDB">
-            <wp:extent cx="3985895" cy="8892540"/>
-            <wp:effectExtent l="0" t="0" r="0" b="3810"/>
-            <wp:docPr id="164946594" name="Obraz 1" descr="Obraz zawierający tekst, zrzut ekranu, Czcionka, oprogramowanie&#10;&#10;Zawartość wygenerowana przez AI może być niepoprawna."/>
+          <wp:inline distT="0" distB="0" distL="0" distR="0" wp14:anchorId="631FE285" wp14:editId="501AC3DE">
+            <wp:extent cx="3686689" cy="8164064"/>
+            <wp:effectExtent l="0" t="0" r="9525" b="8890"/>
+            <wp:docPr id="1715912716" name="Obraz 1" descr="Obraz zawierający tekst, zrzut ekranu, Czcionka, numer&#10;&#10;Zawartość wygenerowana przez AI może być niepoprawna."/>
             <wp:cNvGraphicFramePr>
               <a:graphicFrameLocks xmlns:a="http://schemas.openxmlformats.org/drawingml/2006/main" noChangeAspect="1"/>
             </wp:cNvGraphicFramePr>
@@ -88,7 +88,7 @@
               <a:graphicData uri="http://schemas.openxmlformats.org/drawingml/2006/picture">
                 <pic:pic xmlns:pic="http://schemas.openxmlformats.org/drawingml/2006/picture">
                   <pic:nvPicPr>
-                    <pic:cNvPr id="164946594" name="Obraz 1" descr="Obraz zawierający tekst, zrzut ekranu, Czcionka, oprogramowanie&#10;&#10;Zawartość wygenerowana przez AI może być niepoprawna."/>
+                    <pic:cNvPr id="1715912716" name="Obraz 1" descr="Obraz zawierający tekst, zrzut ekranu, Czcionka, numer&#10;&#10;Zawartość wygenerowana przez AI może być niepoprawna."/>
                     <pic:cNvPicPr/>
                   </pic:nvPicPr>
                   <pic:blipFill>
@@ -100,7 +100,7 @@
                   <pic:spPr>
                     <a:xfrm>
                       <a:off x="0" y="0"/>
-                      <a:ext cx="3985895" cy="8892540"/>
+                      <a:ext cx="3686689" cy="8164064"/>
                     </a:xfrm>
                     <a:prstGeom prst="rect">
                       <a:avLst/>
@@ -125,22 +125,22 @@
           <w:sz w:val="28"/>
           <w:szCs w:val="28"/>
         </w:rPr>
+        <w:t>Tym co nas wita, jest widok logowania do aplikacji. Bez tego użytkownik nie jest w stanie wejść do głównego menu aplikacji.</w:t>
+      </w:r>
+    </w:p>
+    <w:p>
+      <w:pPr>
+        <w:rPr>
+          <w:sz w:val="28"/>
+          <w:szCs w:val="28"/>
+        </w:rPr>
+      </w:pPr>
+      <w:r>
+        <w:rPr>
+          <w:sz w:val="28"/>
+          <w:szCs w:val="28"/>
+        </w:rPr>
         <w:lastRenderedPageBreak/>
-        <w:t>Tym co nas wita, jest widok logowania do aplikacji. Bez tego użytkownik nie jest w stanie wejść do głównego menu aplikacji.</w:t>
-      </w:r>
-    </w:p>
-    <w:p>
-      <w:pPr>
-        <w:rPr>
-          <w:sz w:val="28"/>
-          <w:szCs w:val="28"/>
-        </w:rPr>
-      </w:pPr>
-      <w:r>
-        <w:rPr>
-          <w:sz w:val="28"/>
-          <w:szCs w:val="28"/>
-        </w:rPr>
         <w:t>W Projekcie została zastosowana walidacja danych, aby mail był poprawny, hasło miało co najmniej 6 znaków oraz konto oczywiście musi istnieć.</w:t>
       </w:r>
     </w:p>
@@ -157,10 +157,10 @@
           <w:szCs w:val="28"/>
         </w:rPr>
         <w:drawing>
-          <wp:inline distT="0" distB="0" distL="0" distR="0" wp14:anchorId="3FF47507" wp14:editId="1B5980AA">
-            <wp:extent cx="3150926" cy="6915150"/>
-            <wp:effectExtent l="0" t="0" r="0" b="0"/>
-            <wp:docPr id="90347249" name="Obraz 1" descr="Obraz zawierający tekst, zrzut ekranu, Czcionka, numer&#10;&#10;Zawartość wygenerowana przez AI może być niepoprawna."/>
+          <wp:inline distT="0" distB="0" distL="0" distR="0" wp14:anchorId="73A2F993" wp14:editId="383A4E1F">
+            <wp:extent cx="3406905" cy="7505700"/>
+            <wp:effectExtent l="0" t="0" r="3175" b="0"/>
+            <wp:docPr id="2037289190" name="Obraz 1" descr="Obraz zawierający tekst, zrzut ekranu, Czcionka, System operacyjny&#10;&#10;Zawartość wygenerowana przez AI może być niepoprawna."/>
             <wp:cNvGraphicFramePr>
               <a:graphicFrameLocks xmlns:a="http://schemas.openxmlformats.org/drawingml/2006/main" noChangeAspect="1"/>
             </wp:cNvGraphicFramePr>
@@ -168,7 +168,7 @@
               <a:graphicData uri="http://schemas.openxmlformats.org/drawingml/2006/picture">
                 <pic:pic xmlns:pic="http://schemas.openxmlformats.org/drawingml/2006/picture">
                   <pic:nvPicPr>
-                    <pic:cNvPr id="90347249" name="Obraz 1" descr="Obraz zawierający tekst, zrzut ekranu, Czcionka, numer&#10;&#10;Zawartość wygenerowana przez AI może być niepoprawna."/>
+                    <pic:cNvPr id="2037289190" name="Obraz 1" descr="Obraz zawierający tekst, zrzut ekranu, Czcionka, System operacyjny&#10;&#10;Zawartość wygenerowana przez AI może być niepoprawna."/>
                     <pic:cNvPicPr/>
                   </pic:nvPicPr>
                   <pic:blipFill>
@@ -180,7 +180,7 @@
                   <pic:spPr>
                     <a:xfrm>
                       <a:off x="0" y="0"/>
-                      <a:ext cx="3155249" cy="6924638"/>
+                      <a:ext cx="3410082" cy="7512699"/>
                     </a:xfrm>
                     <a:prstGeom prst="rect">
                       <a:avLst/>
@@ -196,12 +196,16 @@
     <w:p>
       <w:pPr>
         <w:rPr>
-          <w:sz w:val="28"/>
-          <w:szCs w:val="28"/>
-        </w:rPr>
-      </w:pPr>
-      <w:r>
-        <w:rPr>
+          <w:b/>
+          <w:bCs/>
+          <w:sz w:val="28"/>
+          <w:szCs w:val="28"/>
+        </w:rPr>
+      </w:pPr>
+      <w:r>
+        <w:rPr>
+          <w:b/>
+          <w:bCs/>
           <w:sz w:val="28"/>
           <w:szCs w:val="28"/>
         </w:rPr>
@@ -222,10 +226,10 @@
         </w:rPr>
         <w:lastRenderedPageBreak/>
         <w:drawing>
-          <wp:inline distT="0" distB="0" distL="0" distR="0" wp14:anchorId="2957FDA2" wp14:editId="070C0D69">
-            <wp:extent cx="3515381" cy="7839075"/>
-            <wp:effectExtent l="0" t="0" r="8890" b="0"/>
-            <wp:docPr id="742251179" name="Obraz 1" descr="Obraz zawierający tekst, zrzut ekranu, Czcionka, oprogramowanie&#10;&#10;Zawartość wygenerowana przez AI może być niepoprawna."/>
+          <wp:inline distT="0" distB="0" distL="0" distR="0" wp14:anchorId="26F4DEFC" wp14:editId="7E6290BD">
+            <wp:extent cx="3734321" cy="8135485"/>
+            <wp:effectExtent l="0" t="0" r="0" b="0"/>
+            <wp:docPr id="1131421719" name="Obraz 1" descr="Obraz zawierający tekst, zrzut ekranu, multimedia, System operacyjny&#10;&#10;Zawartość wygenerowana przez AI może być niepoprawna."/>
             <wp:cNvGraphicFramePr>
               <a:graphicFrameLocks xmlns:a="http://schemas.openxmlformats.org/drawingml/2006/main" noChangeAspect="1"/>
             </wp:cNvGraphicFramePr>
@@ -233,7 +237,7 @@
               <a:graphicData uri="http://schemas.openxmlformats.org/drawingml/2006/picture">
                 <pic:pic xmlns:pic="http://schemas.openxmlformats.org/drawingml/2006/picture">
                   <pic:nvPicPr>
-                    <pic:cNvPr id="742251179" name="Obraz 1" descr="Obraz zawierający tekst, zrzut ekranu, Czcionka, oprogramowanie&#10;&#10;Zawartość wygenerowana przez AI może być niepoprawna."/>
+                    <pic:cNvPr id="1131421719" name="Obraz 1" descr="Obraz zawierający tekst, zrzut ekranu, multimedia, System operacyjny&#10;&#10;Zawartość wygenerowana przez AI może być niepoprawna."/>
                     <pic:cNvPicPr/>
                   </pic:nvPicPr>
                   <pic:blipFill>
@@ -245,7 +249,7 @@
                   <pic:spPr>
                     <a:xfrm>
                       <a:off x="0" y="0"/>
-                      <a:ext cx="3517671" cy="7844182"/>
+                      <a:ext cx="3734321" cy="8135485"/>
                     </a:xfrm>
                     <a:prstGeom prst="rect">
                       <a:avLst/>
@@ -261,12 +265,16 @@
     <w:p>
       <w:pPr>
         <w:rPr>
-          <w:sz w:val="28"/>
-          <w:szCs w:val="28"/>
-        </w:rPr>
-      </w:pPr>
-      <w:r>
-        <w:rPr>
+          <w:b/>
+          <w:bCs/>
+          <w:sz w:val="28"/>
+          <w:szCs w:val="28"/>
+        </w:rPr>
+      </w:pPr>
+      <w:r>
+        <w:rPr>
+          <w:b/>
+          <w:bCs/>
           <w:sz w:val="28"/>
           <w:szCs w:val="28"/>
         </w:rPr>
@@ -301,12 +309,11 @@
           <w:sz w:val="28"/>
           <w:szCs w:val="28"/>
         </w:rPr>
-        <w:lastRenderedPageBreak/>
         <w:drawing>
-          <wp:inline distT="0" distB="0" distL="0" distR="0" wp14:anchorId="684532CB" wp14:editId="7B93B663">
-            <wp:extent cx="3175805" cy="7010400"/>
-            <wp:effectExtent l="0" t="0" r="5715" b="0"/>
-            <wp:docPr id="1650129199" name="Obraz 1" descr="Obraz zawierający tekst, zrzut ekranu, Czcionka, oprogramowanie&#10;&#10;Zawartość wygenerowana przez AI może być niepoprawna."/>
+          <wp:inline distT="0" distB="0" distL="0" distR="0" wp14:anchorId="052CBEE1" wp14:editId="678BCB8E">
+            <wp:extent cx="3381375" cy="7363502"/>
+            <wp:effectExtent l="0" t="0" r="0" b="8890"/>
+            <wp:docPr id="454495693" name="Obraz 1" descr="Obraz zawierający tekst, zrzut ekranu, Czcionka, numer&#10;&#10;Zawartość wygenerowana przez AI może być niepoprawna."/>
             <wp:cNvGraphicFramePr>
               <a:graphicFrameLocks xmlns:a="http://schemas.openxmlformats.org/drawingml/2006/main" noChangeAspect="1"/>
             </wp:cNvGraphicFramePr>
@@ -314,7 +321,7 @@
               <a:graphicData uri="http://schemas.openxmlformats.org/drawingml/2006/picture">
                 <pic:pic xmlns:pic="http://schemas.openxmlformats.org/drawingml/2006/picture">
                   <pic:nvPicPr>
-                    <pic:cNvPr id="1650129199" name="Obraz 1" descr="Obraz zawierający tekst, zrzut ekranu, Czcionka, oprogramowanie&#10;&#10;Zawartość wygenerowana przez AI może być niepoprawna."/>
+                    <pic:cNvPr id="454495693" name="Obraz 1" descr="Obraz zawierający tekst, zrzut ekranu, Czcionka, numer&#10;&#10;Zawartość wygenerowana przez AI może być niepoprawna."/>
                     <pic:cNvPicPr/>
                   </pic:nvPicPr>
                   <pic:blipFill>
@@ -326,7 +333,7 @@
                   <pic:spPr>
                     <a:xfrm>
                       <a:off x="0" y="0"/>
-                      <a:ext cx="3179171" cy="7017831"/>
+                      <a:ext cx="3393522" cy="7389953"/>
                     </a:xfrm>
                     <a:prstGeom prst="rect">
                       <a:avLst/>
@@ -351,43 +358,56 @@
           <w:sz w:val="28"/>
           <w:szCs w:val="28"/>
         </w:rPr>
-        <w:t>Żeby się zarejestrować, musimy się zalogować. Tutaj także czeka nas walidacja. Email musi być poprawny. Hasło musi mieć co najmniej 6 znaków oraz muszą się zgadzać. Konto o danym emailu nie może istnieć, żeby je stworzyć.</w:t>
-      </w:r>
-    </w:p>
-    <w:p>
-      <w:pPr>
-        <w:rPr>
-          <w:sz w:val="28"/>
-          <w:szCs w:val="28"/>
-        </w:rPr>
-      </w:pPr>
-    </w:p>
-    <w:p>
-      <w:pPr>
-        <w:rPr>
-          <w:sz w:val="28"/>
-          <w:szCs w:val="28"/>
-        </w:rPr>
-      </w:pPr>
-    </w:p>
-    <w:p>
-      <w:pPr>
-        <w:rPr>
-          <w:sz w:val="28"/>
-          <w:szCs w:val="28"/>
-        </w:rPr>
-      </w:pPr>
-      <w:r>
-        <w:rPr>
-          <w:sz w:val="28"/>
-          <w:szCs w:val="28"/>
-        </w:rPr>
-        <w:lastRenderedPageBreak/>
+        <w:t>Żeby się zarejestrować, musimy się zalogować. Tutaj także czeka nas walidacja. Email musi być poprawny. Hasło musi mieć co najmniej 6 znaków oraz muszą się zgadzać. Konto o danym emailu</w:t>
+      </w:r>
+      <w:r>
+        <w:rPr>
+          <w:sz w:val="28"/>
+          <w:szCs w:val="28"/>
+        </w:rPr>
+        <w:t xml:space="preserve"> lub nazwie</w:t>
+      </w:r>
+      <w:r>
+        <w:rPr>
+          <w:sz w:val="28"/>
+          <w:szCs w:val="28"/>
+        </w:rPr>
+        <w:t xml:space="preserve"> nie może istnieć, żeby je stworzyć.</w:t>
+      </w:r>
+    </w:p>
+    <w:p>
+      <w:pPr>
+        <w:rPr>
+          <w:sz w:val="28"/>
+          <w:szCs w:val="28"/>
+        </w:rPr>
+      </w:pPr>
+    </w:p>
+    <w:p>
+      <w:pPr>
+        <w:rPr>
+          <w:sz w:val="28"/>
+          <w:szCs w:val="28"/>
+        </w:rPr>
+      </w:pPr>
+    </w:p>
+    <w:p>
+      <w:pPr>
+        <w:rPr>
+          <w:sz w:val="28"/>
+          <w:szCs w:val="28"/>
+        </w:rPr>
+      </w:pPr>
+      <w:r>
+        <w:rPr>
+          <w:sz w:val="28"/>
+          <w:szCs w:val="28"/>
+        </w:rPr>
         <w:drawing>
-          <wp:inline distT="0" distB="0" distL="0" distR="0" wp14:anchorId="01C9AE33" wp14:editId="30942DBD">
-            <wp:extent cx="2922956" cy="6505575"/>
+          <wp:inline distT="0" distB="0" distL="0" distR="0" wp14:anchorId="0CAC8294" wp14:editId="2766D067">
+            <wp:extent cx="3228460" cy="7181850"/>
             <wp:effectExtent l="0" t="0" r="0" b="0"/>
-            <wp:docPr id="2059566810" name="Obraz 1" descr="Obraz zawierający tekst, zrzut ekranu, Czcionka, numer&#10;&#10;Zawartość wygenerowana przez AI może być niepoprawna."/>
+            <wp:docPr id="2058515959" name="Obraz 1" descr="Obraz zawierający tekst, zrzut ekranu, Czcionka, numer&#10;&#10;Zawartość wygenerowana przez AI może być niepoprawna."/>
             <wp:cNvGraphicFramePr>
               <a:graphicFrameLocks xmlns:a="http://schemas.openxmlformats.org/drawingml/2006/main" noChangeAspect="1"/>
             </wp:cNvGraphicFramePr>
@@ -395,7 +415,7 @@
               <a:graphicData uri="http://schemas.openxmlformats.org/drawingml/2006/picture">
                 <pic:pic xmlns:pic="http://schemas.openxmlformats.org/drawingml/2006/picture">
                   <pic:nvPicPr>
-                    <pic:cNvPr id="2059566810" name="Obraz 1" descr="Obraz zawierający tekst, zrzut ekranu, Czcionka, numer&#10;&#10;Zawartość wygenerowana przez AI może być niepoprawna."/>
+                    <pic:cNvPr id="2058515959" name="Obraz 1" descr="Obraz zawierający tekst, zrzut ekranu, Czcionka, numer&#10;&#10;Zawartość wygenerowana przez AI może być niepoprawna."/>
                     <pic:cNvPicPr/>
                   </pic:nvPicPr>
                   <pic:blipFill>
@@ -407,7 +427,7 @@
                   <pic:spPr>
                     <a:xfrm>
                       <a:off x="0" y="0"/>
-                      <a:ext cx="2924697" cy="6509450"/>
+                      <a:ext cx="3232413" cy="7190644"/>
                     </a:xfrm>
                     <a:prstGeom prst="rect">
                       <a:avLst/>
@@ -450,6 +470,14 @@
           <w:szCs w:val="28"/>
         </w:rPr>
       </w:pPr>
+    </w:p>
+    <w:p>
+      <w:pPr>
+        <w:rPr>
+          <w:sz w:val="28"/>
+          <w:szCs w:val="28"/>
+        </w:rPr>
+      </w:pPr>
       <w:r>
         <w:rPr>
           <w:sz w:val="28"/>
@@ -457,10 +485,10 @@
         </w:rPr>
         <w:lastRenderedPageBreak/>
         <w:drawing>
-          <wp:inline distT="0" distB="0" distL="0" distR="0" wp14:anchorId="4FB4C011" wp14:editId="4DC241E3">
-            <wp:extent cx="3199396" cy="7058025"/>
-            <wp:effectExtent l="0" t="0" r="1270" b="0"/>
-            <wp:docPr id="1239485866" name="Obraz 1" descr="Obraz zawierający tekst, zrzut ekranu, Czcionka&#10;&#10;Zawartość wygenerowana przez AI może być niepoprawna."/>
+          <wp:inline distT="0" distB="0" distL="0" distR="0" wp14:anchorId="0FEEE76F" wp14:editId="0D22380B">
+            <wp:extent cx="3715268" cy="8164064"/>
+            <wp:effectExtent l="0" t="0" r="0" b="8890"/>
+            <wp:docPr id="1792671421" name="Obraz 1" descr="Obraz zawierający tekst, zrzut ekranu, Czcionka, numer&#10;&#10;Zawartość wygenerowana przez AI może być niepoprawna."/>
             <wp:cNvGraphicFramePr>
               <a:graphicFrameLocks xmlns:a="http://schemas.openxmlformats.org/drawingml/2006/main" noChangeAspect="1"/>
             </wp:cNvGraphicFramePr>
@@ -468,7 +496,7 @@
               <a:graphicData uri="http://schemas.openxmlformats.org/drawingml/2006/picture">
                 <pic:pic xmlns:pic="http://schemas.openxmlformats.org/drawingml/2006/picture">
                   <pic:nvPicPr>
-                    <pic:cNvPr id="1239485866" name="Obraz 1" descr="Obraz zawierający tekst, zrzut ekranu, Czcionka&#10;&#10;Zawartość wygenerowana przez AI może być niepoprawna."/>
+                    <pic:cNvPr id="1792671421" name="Obraz 1" descr="Obraz zawierający tekst, zrzut ekranu, Czcionka, numer&#10;&#10;Zawartość wygenerowana przez AI może być niepoprawna."/>
                     <pic:cNvPicPr/>
                   </pic:nvPicPr>
                   <pic:blipFill>
@@ -480,7 +508,7 @@
                   <pic:spPr>
                     <a:xfrm>
                       <a:off x="0" y="0"/>
-                      <a:ext cx="3203436" cy="7066938"/>
+                      <a:ext cx="3715268" cy="8164064"/>
                     </a:xfrm>
                     <a:prstGeom prst="rect">
                       <a:avLst/>
@@ -515,32 +543,9 @@
           <w:szCs w:val="28"/>
         </w:rPr>
       </w:pPr>
-    </w:p>
-    <w:p>
-      <w:pPr>
-        <w:rPr>
-          <w:sz w:val="28"/>
-          <w:szCs w:val="28"/>
-        </w:rPr>
-      </w:pPr>
-    </w:p>
-    <w:p>
-      <w:pPr>
-        <w:rPr>
-          <w:sz w:val="28"/>
-          <w:szCs w:val="28"/>
-        </w:rPr>
-      </w:pPr>
-    </w:p>
-    <w:p>
-      <w:pPr>
-        <w:rPr>
-          <w:sz w:val="28"/>
-          <w:szCs w:val="28"/>
-        </w:rPr>
-      </w:pPr>
-      <w:r>
-        <w:rPr>
+      <w:r>
+        <w:rPr>
+          <w:noProof/>
           <w:sz w:val="28"/>
           <w:szCs w:val="28"/>
         </w:rPr>
@@ -627,6 +632,7 @@
       </w:pPr>
       <w:r>
         <w:rPr>
+          <w:noProof/>
           <w:sz w:val="28"/>
           <w:szCs w:val="28"/>
         </w:rPr>
@@ -692,6 +698,7 @@
       </w:pPr>
       <w:r>
         <w:rPr>
+          <w:noProof/>
           <w:sz w:val="28"/>
           <w:szCs w:val="28"/>
         </w:rPr>
@@ -765,6 +772,7 @@
       </w:pPr>
       <w:r>
         <w:rPr>
+          <w:noProof/>
           <w:sz w:val="28"/>
           <w:szCs w:val="28"/>
         </w:rPr>
@@ -820,6 +828,665 @@
         </w:rPr>
         <w:t>Kiedy stworzymy poprawnie naszą notatkę Mamy możliwość usunięcia jej oraz wejścia do niej by ją zobaczyć lub z edytować.</w:t>
       </w:r>
+    </w:p>
+    <w:p>
+      <w:pPr>
+        <w:rPr>
+          <w:sz w:val="28"/>
+          <w:szCs w:val="28"/>
+        </w:rPr>
+      </w:pPr>
+    </w:p>
+    <w:p>
+      <w:pPr>
+        <w:rPr>
+          <w:sz w:val="28"/>
+          <w:szCs w:val="28"/>
+        </w:rPr>
+      </w:pPr>
+    </w:p>
+    <w:p>
+      <w:pPr>
+        <w:rPr>
+          <w:sz w:val="28"/>
+          <w:szCs w:val="28"/>
+        </w:rPr>
+      </w:pPr>
+    </w:p>
+    <w:p>
+      <w:pPr>
+        <w:rPr>
+          <w:sz w:val="28"/>
+          <w:szCs w:val="28"/>
+        </w:rPr>
+      </w:pPr>
+      <w:r>
+        <w:rPr>
+          <w:sz w:val="28"/>
+          <w:szCs w:val="28"/>
+        </w:rPr>
+        <w:lastRenderedPageBreak/>
+        <w:drawing>
+          <wp:inline distT="0" distB="0" distL="0" distR="0" wp14:anchorId="44C4DDA7" wp14:editId="38D2140D">
+            <wp:extent cx="3810532" cy="8164064"/>
+            <wp:effectExtent l="0" t="0" r="0" b="0"/>
+            <wp:docPr id="176212850" name="Obraz 1" descr="Obraz zawierający tekst, zrzut ekranu, multimedia, oprogramowanie&#10;&#10;Zawartość wygenerowana przez AI może być niepoprawna."/>
+            <wp:cNvGraphicFramePr>
+              <a:graphicFrameLocks xmlns:a="http://schemas.openxmlformats.org/drawingml/2006/main" noChangeAspect="1"/>
+            </wp:cNvGraphicFramePr>
+            <a:graphic xmlns:a="http://schemas.openxmlformats.org/drawingml/2006/main">
+              <a:graphicData uri="http://schemas.openxmlformats.org/drawingml/2006/picture">
+                <pic:pic xmlns:pic="http://schemas.openxmlformats.org/drawingml/2006/picture">
+                  <pic:nvPicPr>
+                    <pic:cNvPr id="176212850" name="Obraz 1" descr="Obraz zawierający tekst, zrzut ekranu, multimedia, oprogramowanie&#10;&#10;Zawartość wygenerowana przez AI może być niepoprawna."/>
+                    <pic:cNvPicPr/>
+                  </pic:nvPicPr>
+                  <pic:blipFill>
+                    <a:blip r:embed="rId16"/>
+                    <a:stretch>
+                      <a:fillRect/>
+                    </a:stretch>
+                  </pic:blipFill>
+                  <pic:spPr>
+                    <a:xfrm>
+                      <a:off x="0" y="0"/>
+                      <a:ext cx="3810532" cy="8164064"/>
+                    </a:xfrm>
+                    <a:prstGeom prst="rect">
+                      <a:avLst/>
+                    </a:prstGeom>
+                  </pic:spPr>
+                </pic:pic>
+              </a:graphicData>
+            </a:graphic>
+          </wp:inline>
+        </w:drawing>
+      </w:r>
+    </w:p>
+    <w:p>
+      <w:pPr>
+        <w:rPr>
+          <w:sz w:val="28"/>
+          <w:szCs w:val="28"/>
+        </w:rPr>
+      </w:pPr>
+      <w:r>
+        <w:rPr>
+          <w:sz w:val="28"/>
+          <w:szCs w:val="28"/>
+        </w:rPr>
+        <w:t xml:space="preserve">Po </w:t>
+      </w:r>
+      <w:proofErr w:type="spellStart"/>
+      <w:r>
+        <w:rPr>
+          <w:sz w:val="28"/>
+          <w:szCs w:val="28"/>
+        </w:rPr>
+        <w:t>Wylogownaiu</w:t>
+      </w:r>
+      <w:proofErr w:type="spellEnd"/>
+      <w:r>
+        <w:rPr>
+          <w:sz w:val="28"/>
+          <w:szCs w:val="28"/>
+        </w:rPr>
+        <w:t xml:space="preserve"> i próby rejestracji na to samo konto już się nie powiedzie.</w:t>
+      </w:r>
+    </w:p>
+    <w:p>
+      <w:pPr>
+        <w:rPr>
+          <w:sz w:val="28"/>
+          <w:szCs w:val="28"/>
+        </w:rPr>
+      </w:pPr>
+    </w:p>
+    <w:p>
+      <w:pPr>
+        <w:rPr>
+          <w:sz w:val="28"/>
+          <w:szCs w:val="28"/>
+        </w:rPr>
+      </w:pPr>
+      <w:r>
+        <w:rPr>
+          <w:sz w:val="28"/>
+          <w:szCs w:val="28"/>
+        </w:rPr>
+        <w:lastRenderedPageBreak/>
+        <w:drawing>
+          <wp:inline distT="0" distB="0" distL="0" distR="0" wp14:anchorId="5D272FF1" wp14:editId="05DE60A0">
+            <wp:extent cx="3667637" cy="8192643"/>
+            <wp:effectExtent l="0" t="0" r="9525" b="0"/>
+            <wp:docPr id="650102258" name="Obraz 1" descr="Obraz zawierający tekst, zrzut ekranu, Czcionka, numer&#10;&#10;Zawartość wygenerowana przez AI może być niepoprawna."/>
+            <wp:cNvGraphicFramePr>
+              <a:graphicFrameLocks xmlns:a="http://schemas.openxmlformats.org/drawingml/2006/main" noChangeAspect="1"/>
+            </wp:cNvGraphicFramePr>
+            <a:graphic xmlns:a="http://schemas.openxmlformats.org/drawingml/2006/main">
+              <a:graphicData uri="http://schemas.openxmlformats.org/drawingml/2006/picture">
+                <pic:pic xmlns:pic="http://schemas.openxmlformats.org/drawingml/2006/picture">
+                  <pic:nvPicPr>
+                    <pic:cNvPr id="650102258" name="Obraz 1" descr="Obraz zawierający tekst, zrzut ekranu, Czcionka, numer&#10;&#10;Zawartość wygenerowana przez AI może być niepoprawna."/>
+                    <pic:cNvPicPr/>
+                  </pic:nvPicPr>
+                  <pic:blipFill>
+                    <a:blip r:embed="rId17"/>
+                    <a:stretch>
+                      <a:fillRect/>
+                    </a:stretch>
+                  </pic:blipFill>
+                  <pic:spPr>
+                    <a:xfrm>
+                      <a:off x="0" y="0"/>
+                      <a:ext cx="3667637" cy="8192643"/>
+                    </a:xfrm>
+                    <a:prstGeom prst="rect">
+                      <a:avLst/>
+                    </a:prstGeom>
+                  </pic:spPr>
+                </pic:pic>
+              </a:graphicData>
+            </a:graphic>
+          </wp:inline>
+        </w:drawing>
+      </w:r>
+    </w:p>
+    <w:p>
+      <w:pPr>
+        <w:rPr>
+          <w:sz w:val="28"/>
+          <w:szCs w:val="28"/>
+        </w:rPr>
+      </w:pPr>
+      <w:r>
+        <w:rPr>
+          <w:sz w:val="28"/>
+          <w:szCs w:val="28"/>
+        </w:rPr>
+        <w:t>A logowanie działa zarówno po loginie jak i emailu.</w:t>
+      </w:r>
+    </w:p>
+    <w:p>
+      <w:pPr>
+        <w:rPr>
+          <w:sz w:val="28"/>
+          <w:szCs w:val="28"/>
+        </w:rPr>
+      </w:pPr>
+    </w:p>
+    <w:p>
+      <w:pPr>
+        <w:rPr>
+          <w:sz w:val="28"/>
+          <w:szCs w:val="28"/>
+        </w:rPr>
+      </w:pPr>
+      <w:r>
+        <w:rPr>
+          <w:sz w:val="28"/>
+          <w:szCs w:val="28"/>
+        </w:rPr>
+        <w:lastRenderedPageBreak/>
+        <w:drawing>
+          <wp:inline distT="0" distB="0" distL="0" distR="0" wp14:anchorId="5EBC3E0E" wp14:editId="34C88E90">
+            <wp:extent cx="3712596" cy="7343775"/>
+            <wp:effectExtent l="0" t="0" r="2540" b="0"/>
+            <wp:docPr id="531293947" name="Obraz 1" descr="Obraz zawierający tekst, zrzut ekranu, oprogramowanie, Oprogramowanie multimedialne&#10;&#10;Zawartość wygenerowana przez AI może być niepoprawna."/>
+            <wp:cNvGraphicFramePr>
+              <a:graphicFrameLocks xmlns:a="http://schemas.openxmlformats.org/drawingml/2006/main" noChangeAspect="1"/>
+            </wp:cNvGraphicFramePr>
+            <a:graphic xmlns:a="http://schemas.openxmlformats.org/drawingml/2006/main">
+              <a:graphicData uri="http://schemas.openxmlformats.org/drawingml/2006/picture">
+                <pic:pic xmlns:pic="http://schemas.openxmlformats.org/drawingml/2006/picture">
+                  <pic:nvPicPr>
+                    <pic:cNvPr id="531293947" name="Obraz 1" descr="Obraz zawierający tekst, zrzut ekranu, oprogramowanie, Oprogramowanie multimedialne&#10;&#10;Zawartość wygenerowana przez AI może być niepoprawna."/>
+                    <pic:cNvPicPr/>
+                  </pic:nvPicPr>
+                  <pic:blipFill>
+                    <a:blip r:embed="rId18"/>
+                    <a:stretch>
+                      <a:fillRect/>
+                    </a:stretch>
+                  </pic:blipFill>
+                  <pic:spPr>
+                    <a:xfrm>
+                      <a:off x="0" y="0"/>
+                      <a:ext cx="3718803" cy="7356052"/>
+                    </a:xfrm>
+                    <a:prstGeom prst="rect">
+                      <a:avLst/>
+                    </a:prstGeom>
+                  </pic:spPr>
+                </pic:pic>
+              </a:graphicData>
+            </a:graphic>
+          </wp:inline>
+        </w:drawing>
+      </w:r>
+    </w:p>
+    <w:p>
+      <w:pPr>
+        <w:rPr>
+          <w:sz w:val="28"/>
+          <w:szCs w:val="28"/>
+        </w:rPr>
+      </w:pPr>
+    </w:p>
+    <w:p>
+      <w:pPr>
+        <w:rPr>
+          <w:sz w:val="28"/>
+          <w:szCs w:val="28"/>
+        </w:rPr>
+      </w:pPr>
+      <w:r>
+        <w:rPr>
+          <w:sz w:val="28"/>
+          <w:szCs w:val="28"/>
+        </w:rPr>
+        <w:t>Aplikacja została zrobiona w „komponentowy sposób” – czyli z podziałem na foldery oraz różne funkcjonalności w osobnych plikach.</w:t>
+      </w:r>
+    </w:p>
+    <w:p>
+      <w:pPr>
+        <w:rPr>
+          <w:sz w:val="28"/>
+          <w:szCs w:val="28"/>
+        </w:rPr>
+      </w:pPr>
+    </w:p>
+    <w:p>
+      <w:pPr>
+        <w:rPr>
+          <w:sz w:val="28"/>
+          <w:szCs w:val="28"/>
+        </w:rPr>
+      </w:pPr>
+      <w:r>
+        <w:rPr>
+          <w:sz w:val="28"/>
+          <w:szCs w:val="28"/>
+        </w:rPr>
+        <w:lastRenderedPageBreak/>
+        <w:drawing>
+          <wp:inline distT="0" distB="0" distL="0" distR="0" wp14:anchorId="6E2914E5" wp14:editId="3F3A56BB">
+            <wp:extent cx="4915586" cy="7563906"/>
+            <wp:effectExtent l="0" t="0" r="0" b="0"/>
+            <wp:docPr id="1818380124" name="Obraz 1" descr="Obraz zawierający tekst, zrzut ekranu, oprogramowanie, wyświetlacz&#10;&#10;Zawartość wygenerowana przez AI może być niepoprawna."/>
+            <wp:cNvGraphicFramePr>
+              <a:graphicFrameLocks xmlns:a="http://schemas.openxmlformats.org/drawingml/2006/main" noChangeAspect="1"/>
+            </wp:cNvGraphicFramePr>
+            <a:graphic xmlns:a="http://schemas.openxmlformats.org/drawingml/2006/main">
+              <a:graphicData uri="http://schemas.openxmlformats.org/drawingml/2006/picture">
+                <pic:pic xmlns:pic="http://schemas.openxmlformats.org/drawingml/2006/picture">
+                  <pic:nvPicPr>
+                    <pic:cNvPr id="1818380124" name="Obraz 1" descr="Obraz zawierający tekst, zrzut ekranu, oprogramowanie, wyświetlacz&#10;&#10;Zawartość wygenerowana przez AI może być niepoprawna."/>
+                    <pic:cNvPicPr/>
+                  </pic:nvPicPr>
+                  <pic:blipFill>
+                    <a:blip r:embed="rId19"/>
+                    <a:stretch>
+                      <a:fillRect/>
+                    </a:stretch>
+                  </pic:blipFill>
+                  <pic:spPr>
+                    <a:xfrm>
+                      <a:off x="0" y="0"/>
+                      <a:ext cx="4915586" cy="7563906"/>
+                    </a:xfrm>
+                    <a:prstGeom prst="rect">
+                      <a:avLst/>
+                    </a:prstGeom>
+                  </pic:spPr>
+                </pic:pic>
+              </a:graphicData>
+            </a:graphic>
+          </wp:inline>
+        </w:drawing>
+      </w:r>
+    </w:p>
+    <w:p>
+      <w:pPr>
+        <w:rPr>
+          <w:sz w:val="28"/>
+          <w:szCs w:val="28"/>
+        </w:rPr>
+      </w:pPr>
+    </w:p>
+    <w:p>
+      <w:pPr>
+        <w:rPr>
+          <w:sz w:val="28"/>
+          <w:szCs w:val="28"/>
+        </w:rPr>
+      </w:pPr>
+      <w:proofErr w:type="spellStart"/>
+      <w:r>
+        <w:rPr>
+          <w:sz w:val="28"/>
+          <w:szCs w:val="28"/>
+        </w:rPr>
+        <w:t>Backend</w:t>
+      </w:r>
+      <w:proofErr w:type="spellEnd"/>
+      <w:r>
+        <w:rPr>
+          <w:sz w:val="28"/>
+          <w:szCs w:val="28"/>
+        </w:rPr>
+        <w:t xml:space="preserve"> został również zrobiony w sposób, aby można było aktualizować bazę danych po zmianie version na wyższą bez konieczności ręcznego usuwania tabel i tworzenia ich na nowo.</w:t>
+      </w:r>
+    </w:p>
+    <w:p>
+      <w:pPr>
+        <w:rPr>
+          <w:sz w:val="28"/>
+          <w:szCs w:val="28"/>
+        </w:rPr>
+      </w:pPr>
+      <w:r>
+        <w:rPr>
+          <w:sz w:val="28"/>
+          <w:szCs w:val="28"/>
+        </w:rPr>
+        <w:lastRenderedPageBreak/>
+        <w:drawing>
+          <wp:inline distT="0" distB="0" distL="0" distR="0" wp14:anchorId="727BCA76" wp14:editId="553884CC">
+            <wp:extent cx="5760720" cy="3629660"/>
+            <wp:effectExtent l="0" t="0" r="0" b="8890"/>
+            <wp:docPr id="822998980" name="Obraz 1" descr="Obraz zawierający tekst, zrzut ekranu, oprogramowanie, wyświetlacz&#10;&#10;Zawartość wygenerowana przez AI może być niepoprawna."/>
+            <wp:cNvGraphicFramePr>
+              <a:graphicFrameLocks xmlns:a="http://schemas.openxmlformats.org/drawingml/2006/main" noChangeAspect="1"/>
+            </wp:cNvGraphicFramePr>
+            <a:graphic xmlns:a="http://schemas.openxmlformats.org/drawingml/2006/main">
+              <a:graphicData uri="http://schemas.openxmlformats.org/drawingml/2006/picture">
+                <pic:pic xmlns:pic="http://schemas.openxmlformats.org/drawingml/2006/picture">
+                  <pic:nvPicPr>
+                    <pic:cNvPr id="822998980" name="Obraz 1" descr="Obraz zawierający tekst, zrzut ekranu, oprogramowanie, wyświetlacz&#10;&#10;Zawartość wygenerowana przez AI może być niepoprawna."/>
+                    <pic:cNvPicPr/>
+                  </pic:nvPicPr>
+                  <pic:blipFill>
+                    <a:blip r:embed="rId20"/>
+                    <a:stretch>
+                      <a:fillRect/>
+                    </a:stretch>
+                  </pic:blipFill>
+                  <pic:spPr>
+                    <a:xfrm>
+                      <a:off x="0" y="0"/>
+                      <a:ext cx="5760720" cy="3629660"/>
+                    </a:xfrm>
+                    <a:prstGeom prst="rect">
+                      <a:avLst/>
+                    </a:prstGeom>
+                  </pic:spPr>
+                </pic:pic>
+              </a:graphicData>
+            </a:graphic>
+          </wp:inline>
+        </w:drawing>
+      </w:r>
+    </w:p>
+    <w:p>
+      <w:pPr>
+        <w:rPr>
+          <w:sz w:val="28"/>
+          <w:szCs w:val="28"/>
+        </w:rPr>
+      </w:pPr>
+      <w:r>
+        <w:rPr>
+          <w:sz w:val="28"/>
+          <w:szCs w:val="28"/>
+        </w:rPr>
+        <w:t xml:space="preserve">Został również zaimplementowany </w:t>
+      </w:r>
+      <w:proofErr w:type="spellStart"/>
+      <w:r>
+        <w:rPr>
+          <w:sz w:val="28"/>
+          <w:szCs w:val="28"/>
+        </w:rPr>
+        <w:t>shared</w:t>
+      </w:r>
+      <w:proofErr w:type="spellEnd"/>
+      <w:r>
+        <w:rPr>
+          <w:sz w:val="28"/>
+          <w:szCs w:val="28"/>
+        </w:rPr>
+        <w:t xml:space="preserve"> </w:t>
+      </w:r>
+      <w:proofErr w:type="spellStart"/>
+      <w:r>
+        <w:rPr>
+          <w:sz w:val="28"/>
+          <w:szCs w:val="28"/>
+        </w:rPr>
+        <w:t>preferences</w:t>
+      </w:r>
+      <w:proofErr w:type="spellEnd"/>
+      <w:r>
+        <w:rPr>
+          <w:sz w:val="28"/>
+          <w:szCs w:val="28"/>
+        </w:rPr>
+        <w:t>, które zapisuje dane w pamięci i pozwala np. zalogować się automatycznie.</w:t>
+      </w:r>
+    </w:p>
+    <w:p>
+      <w:pPr>
+        <w:rPr>
+          <w:sz w:val="28"/>
+          <w:szCs w:val="28"/>
+        </w:rPr>
+      </w:pPr>
+    </w:p>
+    <w:p>
+      <w:pPr>
+        <w:rPr>
+          <w:sz w:val="28"/>
+          <w:szCs w:val="28"/>
+        </w:rPr>
+      </w:pPr>
+    </w:p>
+    <w:p>
+      <w:pPr>
+        <w:rPr>
+          <w:sz w:val="28"/>
+          <w:szCs w:val="28"/>
+        </w:rPr>
+      </w:pPr>
+    </w:p>
+    <w:p>
+      <w:pPr>
+        <w:rPr>
+          <w:sz w:val="28"/>
+          <w:szCs w:val="28"/>
+        </w:rPr>
+      </w:pPr>
+    </w:p>
+    <w:p>
+      <w:pPr>
+        <w:rPr>
+          <w:sz w:val="28"/>
+          <w:szCs w:val="28"/>
+        </w:rPr>
+      </w:pPr>
+    </w:p>
+    <w:p>
+      <w:pPr>
+        <w:rPr>
+          <w:sz w:val="28"/>
+          <w:szCs w:val="28"/>
+        </w:rPr>
+      </w:pPr>
+    </w:p>
+    <w:p>
+      <w:pPr>
+        <w:rPr>
+          <w:sz w:val="28"/>
+          <w:szCs w:val="28"/>
+        </w:rPr>
+      </w:pPr>
+    </w:p>
+    <w:p>
+      <w:pPr>
+        <w:rPr>
+          <w:sz w:val="28"/>
+          <w:szCs w:val="28"/>
+        </w:rPr>
+      </w:pPr>
+    </w:p>
+    <w:p>
+      <w:pPr>
+        <w:rPr>
+          <w:sz w:val="28"/>
+          <w:szCs w:val="28"/>
+        </w:rPr>
+      </w:pPr>
+    </w:p>
+    <w:p>
+      <w:pPr>
+        <w:rPr>
+          <w:sz w:val="28"/>
+          <w:szCs w:val="28"/>
+        </w:rPr>
+      </w:pPr>
+    </w:p>
+    <w:p>
+      <w:pPr>
+        <w:rPr>
+          <w:sz w:val="28"/>
+          <w:szCs w:val="28"/>
+        </w:rPr>
+      </w:pPr>
+    </w:p>
+    <w:p>
+      <w:pPr>
+        <w:rPr>
+          <w:sz w:val="28"/>
+          <w:szCs w:val="28"/>
+        </w:rPr>
+      </w:pPr>
+    </w:p>
+    <w:p>
+      <w:pPr>
+        <w:rPr>
+          <w:sz w:val="28"/>
+          <w:szCs w:val="28"/>
+        </w:rPr>
+      </w:pPr>
+    </w:p>
+    <w:p>
+      <w:pPr>
+        <w:rPr>
+          <w:sz w:val="28"/>
+          <w:szCs w:val="28"/>
+        </w:rPr>
+      </w:pPr>
+      <w:r>
+        <w:rPr>
+          <w:sz w:val="28"/>
+          <w:szCs w:val="28"/>
+        </w:rPr>
+        <w:lastRenderedPageBreak/>
+        <w:t>Wnioski:</w:t>
+      </w:r>
+    </w:p>
+    <w:p>
+      <w:pPr>
+        <w:rPr>
+          <w:sz w:val="28"/>
+          <w:szCs w:val="28"/>
+        </w:rPr>
+      </w:pPr>
+      <w:r>
+        <w:rPr>
+          <w:sz w:val="28"/>
+          <w:szCs w:val="28"/>
+        </w:rPr>
+        <w:t xml:space="preserve">Aplikacja spełnia wymagania po stronie wizualnej jak i również funkcjonalnej. Baza danych w postaci </w:t>
+      </w:r>
+      <w:proofErr w:type="spellStart"/>
+      <w:r>
+        <w:rPr>
+          <w:sz w:val="28"/>
+          <w:szCs w:val="28"/>
+        </w:rPr>
+        <w:t>SQLite</w:t>
+      </w:r>
+      <w:proofErr w:type="spellEnd"/>
+      <w:r>
+        <w:rPr>
+          <w:sz w:val="28"/>
+          <w:szCs w:val="28"/>
+        </w:rPr>
+        <w:t xml:space="preserve"> działa bez zarzutów z wszelkimi normami ustalonymi w zadaniu oraz dodatkowo zrobiono </w:t>
+      </w:r>
+      <w:proofErr w:type="spellStart"/>
+      <w:r>
+        <w:rPr>
+          <w:sz w:val="28"/>
+          <w:szCs w:val="28"/>
+        </w:rPr>
+        <w:t>CRUDa</w:t>
+      </w:r>
+      <w:proofErr w:type="spellEnd"/>
+      <w:r>
+        <w:rPr>
+          <w:sz w:val="28"/>
+          <w:szCs w:val="28"/>
+        </w:rPr>
+        <w:t xml:space="preserve"> w postaci notatek przypisanych do każdego konta. Została zaimplementowana również walidacja z unikatowymi nazwami oraz emailami.  </w:t>
+      </w:r>
+      <w:r>
+        <w:rPr>
+          <w:sz w:val="28"/>
+          <w:szCs w:val="28"/>
+        </w:rPr>
+        <w:t>Aplikacja została napisana z podziałem na foldery. Funkcjonalności zostały również podzielone na różne pliki co sprawia, że aplikacja jest czytelna</w:t>
+      </w:r>
+      <w:r>
+        <w:rPr>
+          <w:sz w:val="28"/>
+          <w:szCs w:val="28"/>
+        </w:rPr>
+        <w:t xml:space="preserve">. </w:t>
+      </w:r>
+      <w:r>
+        <w:rPr>
+          <w:sz w:val="28"/>
+          <w:szCs w:val="28"/>
+        </w:rPr>
+        <w:t xml:space="preserve">Został również zaimplementowany </w:t>
+      </w:r>
+      <w:proofErr w:type="spellStart"/>
+      <w:r>
+        <w:rPr>
+          <w:sz w:val="28"/>
+          <w:szCs w:val="28"/>
+        </w:rPr>
+        <w:t>shared</w:t>
+      </w:r>
+      <w:proofErr w:type="spellEnd"/>
+      <w:r>
+        <w:rPr>
+          <w:sz w:val="28"/>
+          <w:szCs w:val="28"/>
+        </w:rPr>
+        <w:t xml:space="preserve"> </w:t>
+      </w:r>
+      <w:proofErr w:type="spellStart"/>
+      <w:r>
+        <w:rPr>
+          <w:sz w:val="28"/>
+          <w:szCs w:val="28"/>
+        </w:rPr>
+        <w:t>preferences</w:t>
+      </w:r>
+      <w:proofErr w:type="spellEnd"/>
     </w:p>
     <w:sectPr>
       <w:pgSz w:w="11906" w:h="16838"/>

</xml_diff>